<commit_message>
Readiness Word files rebuilt for the closed O-15 decisions
The two readiness volumes and the Word files of DOC-B09, DOC-B10, DOC-F02, DOC-F11, DOC-F12, DOC-F13,
DOC-F15, DOC-F17 and DOC-S06, whose decision rows now record the approval and implementation of the
design-review fixes (ADR 0011).

Co-Authored-By: Claude Opus 5.5 <noreply@anthropic.com>
Claude-Session: https://claude.ai/code/session_012HHcRrzuvMBTL2FYxXtsyv
</commit_message>
<xml_diff>
--- a/treasury-platform/docs/30-readiness/word/DOC-B09-raci-and-decision-ownership.docx
+++ b/treasury-platform/docs/30-readiness/word/DOC-B09-raci-and-decision-ownership.docx
@@ -5688,14 +5688,47 @@
             </w:pPr>
             <w:r>
               <w:rPr>
-                <w:rFonts w:ascii="Arial" w:cs="Arial" w:eastAsia="Arial" w:hAnsi="Arial"/>
-                <w:b w:val="false"/>
-                <w:bCs w:val="false"/>
-                <w:sz w:val="18"/>
-                <w:szCs w:val="18"/>
-                <w:rtl/>
-              </w:rPr>
-              <w:t xml:space="preserve">مفتوح (O-15 في 20-database-design، :543)</w:t>
+                <w:rFonts w:ascii="Segoe UI Emoji" w:cs="Segoe UI Emoji" w:eastAsia="Segoe UI Emoji" w:hAnsi="Segoe UI Emoji"/>
+                <w:sz w:val="18"/>
+                <w:szCs w:val="18"/>
+                <w:rtl/>
+              </w:rPr>
+              <w:t xml:space="preserve">✅</w:t>
+            </w:r>
+            <w:r>
+              <w:rPr>
+                <w:rFonts w:ascii="Arial" w:cs="Arial" w:eastAsia="Arial" w:hAnsi="Arial"/>
+                <w:b w:val="false"/>
+                <w:bCs w:val="false"/>
+                <w:sz w:val="18"/>
+                <w:szCs w:val="18"/>
+                <w:rtl/>
+              </w:rPr>
+              <w:t xml:space="preserve"> مغلق: اعتمده المالك 2026-10-13 (O-15، </w:t>
+            </w:r>
+            <w:r>
+              <w:rPr>
+                <w:rFonts w:ascii="Courier New" w:cs="Courier New" w:eastAsia="Courier New" w:hAnsi="Courier New"/>
+                <w:b w:val="false"/>
+                <w:bCs w:val="false"/>
+                <w:color w:val="1F2937"/>
+                <w:sz w:val="16"/>
+                <w:szCs w:val="16"/>
+                <w:shd w:fill="F1F3F5" w:color="auto" w:val="clear"/>
+                <w:rtl/>
+              </w:rPr>
+              <w:t xml:space="preserve">‎docs/32-review-findings-decisions.md‎</w:t>
+            </w:r>
+            <w:r>
+              <w:rPr>
+                <w:rFonts w:ascii="Arial" w:cs="Arial" w:eastAsia="Arial" w:hAnsi="Arial"/>
+                <w:b w:val="false"/>
+                <w:bCs w:val="false"/>
+                <w:sz w:val="18"/>
+                <w:szCs w:val="18"/>
+                <w:rtl/>
+              </w:rPr>
+              <w:t xml:space="preserve">، ADR 0011)</w:t>
             </w:r>
           </w:p>
         </w:tc>
@@ -17677,11 +17710,11 @@
         </w:tblBorders>
       </w:tblPr>
       <w:tblGrid>
-        <w:gridCol w:w="1041"/>
-        <w:gridCol w:w="897"/>
-        <w:gridCol w:w="897"/>
-        <w:gridCol w:w="1691"/>
-        <w:gridCol w:w="5338"/>
+        <w:gridCol w:w="1024"/>
+        <w:gridCol w:w="896"/>
+        <w:gridCol w:w="896"/>
+        <w:gridCol w:w="1665"/>
+        <w:gridCol w:w="5383"/>
       </w:tblGrid>
       <w:tr>
         <w:trPr>
@@ -17690,7 +17723,7 @@
         </w:trPr>
         <w:tc>
           <w:tcPr>
-            <w:tcW w:type="dxa" w:w="1041"/>
+            <w:tcW w:type="dxa" w:w="1024"/>
             <w:tcBorders>
               <w:top w:val="single" w:color="BFC9D6" w:sz="4"/>
               <w:left w:val="single" w:color="BFC9D6" w:sz="4"/>
@@ -17728,7 +17761,7 @@
         </w:tc>
         <w:tc>
           <w:tcPr>
-            <w:tcW w:type="dxa" w:w="897"/>
+            <w:tcW w:type="dxa" w:w="896"/>
             <w:tcBorders>
               <w:top w:val="single" w:color="BFC9D6" w:sz="4"/>
               <w:left w:val="single" w:color="BFC9D6" w:sz="4"/>
@@ -17766,7 +17799,7 @@
         </w:tc>
         <w:tc>
           <w:tcPr>
-            <w:tcW w:type="dxa" w:w="897"/>
+            <w:tcW w:type="dxa" w:w="896"/>
             <w:tcBorders>
               <w:top w:val="single" w:color="BFC9D6" w:sz="4"/>
               <w:left w:val="single" w:color="BFC9D6" w:sz="4"/>
@@ -17804,7 +17837,7 @@
         </w:tc>
         <w:tc>
           <w:tcPr>
-            <w:tcW w:type="dxa" w:w="1691"/>
+            <w:tcW w:type="dxa" w:w="1665"/>
             <w:tcBorders>
               <w:top w:val="single" w:color="BFC9D6" w:sz="4"/>
               <w:left w:val="single" w:color="BFC9D6" w:sz="4"/>
@@ -17842,7 +17875,7 @@
         </w:tc>
         <w:tc>
           <w:tcPr>
-            <w:tcW w:type="dxa" w:w="5338"/>
+            <w:tcW w:type="dxa" w:w="5383"/>
             <w:tcBorders>
               <w:top w:val="single" w:color="BFC9D6" w:sz="4"/>
               <w:left w:val="single" w:color="BFC9D6" w:sz="4"/>
@@ -17885,7 +17918,7 @@
         </w:trPr>
         <w:tc>
           <w:tcPr>
-            <w:tcW w:type="dxa" w:w="1041"/>
+            <w:tcW w:type="dxa" w:w="1024"/>
             <w:tcBorders>
               <w:top w:val="single" w:color="BFC9D6" w:sz="4"/>
               <w:left w:val="single" w:color="BFC9D6" w:sz="4"/>
@@ -17921,7 +17954,7 @@
         </w:tc>
         <w:tc>
           <w:tcPr>
-            <w:tcW w:type="dxa" w:w="897"/>
+            <w:tcW w:type="dxa" w:w="896"/>
             <w:tcBorders>
               <w:top w:val="single" w:color="BFC9D6" w:sz="4"/>
               <w:left w:val="single" w:color="BFC9D6" w:sz="4"/>
@@ -17957,7 +17990,7 @@
         </w:tc>
         <w:tc>
           <w:tcPr>
-            <w:tcW w:type="dxa" w:w="897"/>
+            <w:tcW w:type="dxa" w:w="896"/>
             <w:tcBorders>
               <w:top w:val="single" w:color="BFC9D6" w:sz="4"/>
               <w:left w:val="single" w:color="BFC9D6" w:sz="4"/>
@@ -17993,7 +18026,7 @@
         </w:tc>
         <w:tc>
           <w:tcPr>
-            <w:tcW w:type="dxa" w:w="1691"/>
+            <w:tcW w:type="dxa" w:w="1665"/>
             <w:tcBorders>
               <w:top w:val="single" w:color="BFC9D6" w:sz="4"/>
               <w:left w:val="single" w:color="BFC9D6" w:sz="4"/>
@@ -18029,7 +18062,7 @@
         </w:tc>
         <w:tc>
           <w:tcPr>
-            <w:tcW w:type="dxa" w:w="5338"/>
+            <w:tcW w:type="dxa" w:w="5383"/>
             <w:tcBorders>
               <w:top w:val="single" w:color="BFC9D6" w:sz="4"/>
               <w:left w:val="single" w:color="BFC9D6" w:sz="4"/>
@@ -18070,7 +18103,7 @@
         </w:trPr>
         <w:tc>
           <w:tcPr>
-            <w:tcW w:type="dxa" w:w="1041"/>
+            <w:tcW w:type="dxa" w:w="1024"/>
             <w:tcBorders>
               <w:top w:val="single" w:color="BFC9D6" w:sz="4"/>
               <w:left w:val="single" w:color="BFC9D6" w:sz="4"/>
@@ -18107,7 +18140,7 @@
         </w:tc>
         <w:tc>
           <w:tcPr>
-            <w:tcW w:type="dxa" w:w="897"/>
+            <w:tcW w:type="dxa" w:w="896"/>
             <w:tcBorders>
               <w:top w:val="single" w:color="BFC9D6" w:sz="4"/>
               <w:left w:val="single" w:color="BFC9D6" w:sz="4"/>
@@ -18144,7 +18177,7 @@
         </w:tc>
         <w:tc>
           <w:tcPr>
-            <w:tcW w:type="dxa" w:w="897"/>
+            <w:tcW w:type="dxa" w:w="896"/>
             <w:tcBorders>
               <w:top w:val="single" w:color="BFC9D6" w:sz="4"/>
               <w:left w:val="single" w:color="BFC9D6" w:sz="4"/>
@@ -18181,7 +18214,7 @@
         </w:tc>
         <w:tc>
           <w:tcPr>
-            <w:tcW w:type="dxa" w:w="1691"/>
+            <w:tcW w:type="dxa" w:w="1665"/>
             <w:tcBorders>
               <w:top w:val="single" w:color="BFC9D6" w:sz="4"/>
               <w:left w:val="single" w:color="BFC9D6" w:sz="4"/>
@@ -18218,7 +18251,7 @@
         </w:tc>
         <w:tc>
           <w:tcPr>
-            <w:tcW w:type="dxa" w:w="5338"/>
+            <w:tcW w:type="dxa" w:w="5383"/>
             <w:tcBorders>
               <w:top w:val="single" w:color="BFC9D6" w:sz="4"/>
               <w:left w:val="single" w:color="BFC9D6" w:sz="4"/>
@@ -18260,7 +18293,7 @@
         </w:trPr>
         <w:tc>
           <w:tcPr>
-            <w:tcW w:type="dxa" w:w="1041"/>
+            <w:tcW w:type="dxa" w:w="1024"/>
             <w:tcBorders>
               <w:top w:val="single" w:color="BFC9D6" w:sz="4"/>
               <w:left w:val="single" w:color="BFC9D6" w:sz="4"/>
@@ -18296,7 +18329,7 @@
         </w:tc>
         <w:tc>
           <w:tcPr>
-            <w:tcW w:type="dxa" w:w="897"/>
+            <w:tcW w:type="dxa" w:w="896"/>
             <w:tcBorders>
               <w:top w:val="single" w:color="BFC9D6" w:sz="4"/>
               <w:left w:val="single" w:color="BFC9D6" w:sz="4"/>
@@ -18332,7 +18365,7 @@
         </w:tc>
         <w:tc>
           <w:tcPr>
-            <w:tcW w:type="dxa" w:w="897"/>
+            <w:tcW w:type="dxa" w:w="896"/>
             <w:tcBorders>
               <w:top w:val="single" w:color="BFC9D6" w:sz="4"/>
               <w:left w:val="single" w:color="BFC9D6" w:sz="4"/>
@@ -18368,7 +18401,7 @@
         </w:tc>
         <w:tc>
           <w:tcPr>
-            <w:tcW w:type="dxa" w:w="1691"/>
+            <w:tcW w:type="dxa" w:w="1665"/>
             <w:tcBorders>
               <w:top w:val="single" w:color="BFC9D6" w:sz="4"/>
               <w:left w:val="single" w:color="BFC9D6" w:sz="4"/>
@@ -18404,7 +18437,7 @@
         </w:tc>
         <w:tc>
           <w:tcPr>
-            <w:tcW w:type="dxa" w:w="5338"/>
+            <w:tcW w:type="dxa" w:w="5383"/>
             <w:tcBorders>
               <w:top w:val="single" w:color="BFC9D6" w:sz="4"/>
               <w:left w:val="single" w:color="BFC9D6" w:sz="4"/>
@@ -18445,7 +18478,7 @@
         </w:trPr>
         <w:tc>
           <w:tcPr>
-            <w:tcW w:type="dxa" w:w="1041"/>
+            <w:tcW w:type="dxa" w:w="1024"/>
             <w:tcBorders>
               <w:top w:val="single" w:color="BFC9D6" w:sz="4"/>
               <w:left w:val="single" w:color="BFC9D6" w:sz="4"/>
@@ -18482,7 +18515,7 @@
         </w:tc>
         <w:tc>
           <w:tcPr>
-            <w:tcW w:type="dxa" w:w="897"/>
+            <w:tcW w:type="dxa" w:w="896"/>
             <w:tcBorders>
               <w:top w:val="single" w:color="BFC9D6" w:sz="4"/>
               <w:left w:val="single" w:color="BFC9D6" w:sz="4"/>
@@ -18519,7 +18552,7 @@
         </w:tc>
         <w:tc>
           <w:tcPr>
-            <w:tcW w:type="dxa" w:w="897"/>
+            <w:tcW w:type="dxa" w:w="896"/>
             <w:tcBorders>
               <w:top w:val="single" w:color="BFC9D6" w:sz="4"/>
               <w:left w:val="single" w:color="BFC9D6" w:sz="4"/>
@@ -18556,7 +18589,7 @@
         </w:tc>
         <w:tc>
           <w:tcPr>
-            <w:tcW w:type="dxa" w:w="1691"/>
+            <w:tcW w:type="dxa" w:w="1665"/>
             <w:tcBorders>
               <w:top w:val="single" w:color="BFC9D6" w:sz="4"/>
               <w:left w:val="single" w:color="BFC9D6" w:sz="4"/>
@@ -18593,7 +18626,7 @@
         </w:tc>
         <w:tc>
           <w:tcPr>
-            <w:tcW w:type="dxa" w:w="5338"/>
+            <w:tcW w:type="dxa" w:w="5383"/>
             <w:tcBorders>
               <w:top w:val="single" w:color="BFC9D6" w:sz="4"/>
               <w:left w:val="single" w:color="BFC9D6" w:sz="4"/>
@@ -18635,7 +18668,7 @@
         </w:trPr>
         <w:tc>
           <w:tcPr>
-            <w:tcW w:type="dxa" w:w="1041"/>
+            <w:tcW w:type="dxa" w:w="1024"/>
             <w:tcBorders>
               <w:top w:val="single" w:color="BFC9D6" w:sz="4"/>
               <w:left w:val="single" w:color="BFC9D6" w:sz="4"/>
@@ -18671,7 +18704,7 @@
         </w:tc>
         <w:tc>
           <w:tcPr>
-            <w:tcW w:type="dxa" w:w="897"/>
+            <w:tcW w:type="dxa" w:w="896"/>
             <w:tcBorders>
               <w:top w:val="single" w:color="BFC9D6" w:sz="4"/>
               <w:left w:val="single" w:color="BFC9D6" w:sz="4"/>
@@ -18707,7 +18740,7 @@
         </w:tc>
         <w:tc>
           <w:tcPr>
-            <w:tcW w:type="dxa" w:w="897"/>
+            <w:tcW w:type="dxa" w:w="896"/>
             <w:tcBorders>
               <w:top w:val="single" w:color="BFC9D6" w:sz="4"/>
               <w:left w:val="single" w:color="BFC9D6" w:sz="4"/>
@@ -18743,7 +18776,7 @@
         </w:tc>
         <w:tc>
           <w:tcPr>
-            <w:tcW w:type="dxa" w:w="1691"/>
+            <w:tcW w:type="dxa" w:w="1665"/>
             <w:tcBorders>
               <w:top w:val="single" w:color="BFC9D6" w:sz="4"/>
               <w:left w:val="single" w:color="BFC9D6" w:sz="4"/>
@@ -18779,7 +18812,7 @@
         </w:tc>
         <w:tc>
           <w:tcPr>
-            <w:tcW w:type="dxa" w:w="5338"/>
+            <w:tcW w:type="dxa" w:w="5383"/>
             <w:tcBorders>
               <w:top w:val="single" w:color="BFC9D6" w:sz="4"/>
               <w:left w:val="single" w:color="BFC9D6" w:sz="4"/>
@@ -18820,7 +18853,7 @@
         </w:trPr>
         <w:tc>
           <w:tcPr>
-            <w:tcW w:type="dxa" w:w="1041"/>
+            <w:tcW w:type="dxa" w:w="1024"/>
             <w:tcBorders>
               <w:top w:val="single" w:color="BFC9D6" w:sz="4"/>
               <w:left w:val="single" w:color="BFC9D6" w:sz="4"/>
@@ -18857,7 +18890,7 @@
         </w:tc>
         <w:tc>
           <w:tcPr>
-            <w:tcW w:type="dxa" w:w="897"/>
+            <w:tcW w:type="dxa" w:w="896"/>
             <w:tcBorders>
               <w:top w:val="single" w:color="BFC9D6" w:sz="4"/>
               <w:left w:val="single" w:color="BFC9D6" w:sz="4"/>
@@ -18894,7 +18927,7 @@
         </w:tc>
         <w:tc>
           <w:tcPr>
-            <w:tcW w:type="dxa" w:w="897"/>
+            <w:tcW w:type="dxa" w:w="896"/>
             <w:tcBorders>
               <w:top w:val="single" w:color="BFC9D6" w:sz="4"/>
               <w:left w:val="single" w:color="BFC9D6" w:sz="4"/>
@@ -18931,7 +18964,7 @@
         </w:tc>
         <w:tc>
           <w:tcPr>
-            <w:tcW w:type="dxa" w:w="1691"/>
+            <w:tcW w:type="dxa" w:w="1665"/>
             <w:tcBorders>
               <w:top w:val="single" w:color="BFC9D6" w:sz="4"/>
               <w:left w:val="single" w:color="BFC9D6" w:sz="4"/>
@@ -18968,7 +19001,7 @@
         </w:tc>
         <w:tc>
           <w:tcPr>
-            <w:tcW w:type="dxa" w:w="5338"/>
+            <w:tcW w:type="dxa" w:w="5383"/>
             <w:tcBorders>
               <w:top w:val="single" w:color="BFC9D6" w:sz="4"/>
               <w:left w:val="single" w:color="BFC9D6" w:sz="4"/>
@@ -19010,7 +19043,7 @@
         </w:trPr>
         <w:tc>
           <w:tcPr>
-            <w:tcW w:type="dxa" w:w="1041"/>
+            <w:tcW w:type="dxa" w:w="1024"/>
             <w:tcBorders>
               <w:top w:val="single" w:color="BFC9D6" w:sz="4"/>
               <w:left w:val="single" w:color="BFC9D6" w:sz="4"/>
@@ -19046,7 +19079,7 @@
         </w:tc>
         <w:tc>
           <w:tcPr>
-            <w:tcW w:type="dxa" w:w="897"/>
+            <w:tcW w:type="dxa" w:w="896"/>
             <w:tcBorders>
               <w:top w:val="single" w:color="BFC9D6" w:sz="4"/>
               <w:left w:val="single" w:color="BFC9D6" w:sz="4"/>
@@ -19082,7 +19115,7 @@
         </w:tc>
         <w:tc>
           <w:tcPr>
-            <w:tcW w:type="dxa" w:w="897"/>
+            <w:tcW w:type="dxa" w:w="896"/>
             <w:tcBorders>
               <w:top w:val="single" w:color="BFC9D6" w:sz="4"/>
               <w:left w:val="single" w:color="BFC9D6" w:sz="4"/>
@@ -19118,7 +19151,7 @@
         </w:tc>
         <w:tc>
           <w:tcPr>
-            <w:tcW w:type="dxa" w:w="1691"/>
+            <w:tcW w:type="dxa" w:w="1665"/>
             <w:tcBorders>
               <w:top w:val="single" w:color="BFC9D6" w:sz="4"/>
               <w:left w:val="single" w:color="BFC9D6" w:sz="4"/>
@@ -19154,7 +19187,7 @@
         </w:tc>
         <w:tc>
           <w:tcPr>
-            <w:tcW w:type="dxa" w:w="5338"/>
+            <w:tcW w:type="dxa" w:w="5383"/>
             <w:tcBorders>
               <w:top w:val="single" w:color="BFC9D6" w:sz="4"/>
               <w:left w:val="single" w:color="BFC9D6" w:sz="4"/>
@@ -19195,7 +19228,7 @@
         </w:trPr>
         <w:tc>
           <w:tcPr>
-            <w:tcW w:type="dxa" w:w="1041"/>
+            <w:tcW w:type="dxa" w:w="1024"/>
             <w:tcBorders>
               <w:top w:val="single" w:color="BFC9D6" w:sz="4"/>
               <w:left w:val="single" w:color="BFC9D6" w:sz="4"/>
@@ -19232,7 +19265,7 @@
         </w:tc>
         <w:tc>
           <w:tcPr>
-            <w:tcW w:type="dxa" w:w="897"/>
+            <w:tcW w:type="dxa" w:w="896"/>
             <w:tcBorders>
               <w:top w:val="single" w:color="BFC9D6" w:sz="4"/>
               <w:left w:val="single" w:color="BFC9D6" w:sz="4"/>
@@ -19269,7 +19302,7 @@
         </w:tc>
         <w:tc>
           <w:tcPr>
-            <w:tcW w:type="dxa" w:w="897"/>
+            <w:tcW w:type="dxa" w:w="896"/>
             <w:tcBorders>
               <w:top w:val="single" w:color="BFC9D6" w:sz="4"/>
               <w:left w:val="single" w:color="BFC9D6" w:sz="4"/>
@@ -19306,7 +19339,7 @@
         </w:tc>
         <w:tc>
           <w:tcPr>
-            <w:tcW w:type="dxa" w:w="1691"/>
+            <w:tcW w:type="dxa" w:w="1665"/>
             <w:tcBorders>
               <w:top w:val="single" w:color="BFC9D6" w:sz="4"/>
               <w:left w:val="single" w:color="BFC9D6" w:sz="4"/>
@@ -19343,7 +19376,7 @@
         </w:tc>
         <w:tc>
           <w:tcPr>
-            <w:tcW w:type="dxa" w:w="5338"/>
+            <w:tcW w:type="dxa" w:w="5383"/>
             <w:tcBorders>
               <w:top w:val="single" w:color="BFC9D6" w:sz="4"/>
               <w:left w:val="single" w:color="BFC9D6" w:sz="4"/>
@@ -19385,7 +19418,7 @@
         </w:trPr>
         <w:tc>
           <w:tcPr>
-            <w:tcW w:type="dxa" w:w="1041"/>
+            <w:tcW w:type="dxa" w:w="1024"/>
             <w:tcBorders>
               <w:top w:val="single" w:color="BFC9D6" w:sz="4"/>
               <w:left w:val="single" w:color="BFC9D6" w:sz="4"/>
@@ -19421,7 +19454,7 @@
         </w:tc>
         <w:tc>
           <w:tcPr>
-            <w:tcW w:type="dxa" w:w="897"/>
+            <w:tcW w:type="dxa" w:w="896"/>
             <w:tcBorders>
               <w:top w:val="single" w:color="BFC9D6" w:sz="4"/>
               <w:left w:val="single" w:color="BFC9D6" w:sz="4"/>
@@ -19457,7 +19490,7 @@
         </w:tc>
         <w:tc>
           <w:tcPr>
-            <w:tcW w:type="dxa" w:w="897"/>
+            <w:tcW w:type="dxa" w:w="896"/>
             <w:tcBorders>
               <w:top w:val="single" w:color="BFC9D6" w:sz="4"/>
               <w:left w:val="single" w:color="BFC9D6" w:sz="4"/>
@@ -19493,7 +19526,7 @@
         </w:tc>
         <w:tc>
           <w:tcPr>
-            <w:tcW w:type="dxa" w:w="1691"/>
+            <w:tcW w:type="dxa" w:w="1665"/>
             <w:tcBorders>
               <w:top w:val="single" w:color="BFC9D6" w:sz="4"/>
               <w:left w:val="single" w:color="BFC9D6" w:sz="4"/>
@@ -19529,7 +19562,7 @@
         </w:tc>
         <w:tc>
           <w:tcPr>
-            <w:tcW w:type="dxa" w:w="5338"/>
+            <w:tcW w:type="dxa" w:w="5383"/>
             <w:tcBorders>
               <w:top w:val="single" w:color="BFC9D6" w:sz="4"/>
               <w:left w:val="single" w:color="BFC9D6" w:sz="4"/>
@@ -19570,7 +19603,7 @@
         </w:trPr>
         <w:tc>
           <w:tcPr>
-            <w:tcW w:type="dxa" w:w="1041"/>
+            <w:tcW w:type="dxa" w:w="1024"/>
             <w:tcBorders>
               <w:top w:val="single" w:color="BFC9D6" w:sz="4"/>
               <w:left w:val="single" w:color="BFC9D6" w:sz="4"/>
@@ -19607,7 +19640,7 @@
         </w:tc>
         <w:tc>
           <w:tcPr>
-            <w:tcW w:type="dxa" w:w="897"/>
+            <w:tcW w:type="dxa" w:w="896"/>
             <w:tcBorders>
               <w:top w:val="single" w:color="BFC9D6" w:sz="4"/>
               <w:left w:val="single" w:color="BFC9D6" w:sz="4"/>
@@ -19644,7 +19677,7 @@
         </w:tc>
         <w:tc>
           <w:tcPr>
-            <w:tcW w:type="dxa" w:w="897"/>
+            <w:tcW w:type="dxa" w:w="896"/>
             <w:tcBorders>
               <w:top w:val="single" w:color="BFC9D6" w:sz="4"/>
               <w:left w:val="single" w:color="BFC9D6" w:sz="4"/>
@@ -19681,7 +19714,7 @@
         </w:tc>
         <w:tc>
           <w:tcPr>
-            <w:tcW w:type="dxa" w:w="1691"/>
+            <w:tcW w:type="dxa" w:w="1665"/>
             <w:tcBorders>
               <w:top w:val="single" w:color="BFC9D6" w:sz="4"/>
               <w:left w:val="single" w:color="BFC9D6" w:sz="4"/>
@@ -19718,7 +19751,7 @@
         </w:tc>
         <w:tc>
           <w:tcPr>
-            <w:tcW w:type="dxa" w:w="5338"/>
+            <w:tcW w:type="dxa" w:w="5383"/>
             <w:tcBorders>
               <w:top w:val="single" w:color="BFC9D6" w:sz="4"/>
               <w:left w:val="single" w:color="BFC9D6" w:sz="4"/>
@@ -19760,7 +19793,7 @@
         </w:trPr>
         <w:tc>
           <w:tcPr>
-            <w:tcW w:type="dxa" w:w="1041"/>
+            <w:tcW w:type="dxa" w:w="1024"/>
             <w:tcBorders>
               <w:top w:val="single" w:color="BFC9D6" w:sz="4"/>
               <w:left w:val="single" w:color="BFC9D6" w:sz="4"/>
@@ -19796,7 +19829,7 @@
         </w:tc>
         <w:tc>
           <w:tcPr>
-            <w:tcW w:type="dxa" w:w="897"/>
+            <w:tcW w:type="dxa" w:w="896"/>
             <w:tcBorders>
               <w:top w:val="single" w:color="BFC9D6" w:sz="4"/>
               <w:left w:val="single" w:color="BFC9D6" w:sz="4"/>
@@ -19832,7 +19865,7 @@
         </w:tc>
         <w:tc>
           <w:tcPr>
-            <w:tcW w:type="dxa" w:w="897"/>
+            <w:tcW w:type="dxa" w:w="896"/>
             <w:tcBorders>
               <w:top w:val="single" w:color="BFC9D6" w:sz="4"/>
               <w:left w:val="single" w:color="BFC9D6" w:sz="4"/>
@@ -19868,7 +19901,7 @@
         </w:tc>
         <w:tc>
           <w:tcPr>
-            <w:tcW w:type="dxa" w:w="1691"/>
+            <w:tcW w:type="dxa" w:w="1665"/>
             <w:tcBorders>
               <w:top w:val="single" w:color="BFC9D6" w:sz="4"/>
               <w:left w:val="single" w:color="BFC9D6" w:sz="4"/>
@@ -19904,7 +19937,7 @@
         </w:tc>
         <w:tc>
           <w:tcPr>
-            <w:tcW w:type="dxa" w:w="5338"/>
+            <w:tcW w:type="dxa" w:w="5383"/>
             <w:tcBorders>
               <w:top w:val="single" w:color="BFC9D6" w:sz="4"/>
               <w:left w:val="single" w:color="BFC9D6" w:sz="4"/>
@@ -19945,7 +19978,7 @@
         </w:trPr>
         <w:tc>
           <w:tcPr>
-            <w:tcW w:type="dxa" w:w="1041"/>
+            <w:tcW w:type="dxa" w:w="1024"/>
             <w:tcBorders>
               <w:top w:val="single" w:color="BFC9D6" w:sz="4"/>
               <w:left w:val="single" w:color="BFC9D6" w:sz="4"/>
@@ -19982,7 +20015,7 @@
         </w:tc>
         <w:tc>
           <w:tcPr>
-            <w:tcW w:type="dxa" w:w="897"/>
+            <w:tcW w:type="dxa" w:w="896"/>
             <w:tcBorders>
               <w:top w:val="single" w:color="BFC9D6" w:sz="4"/>
               <w:left w:val="single" w:color="BFC9D6" w:sz="4"/>
@@ -20019,7 +20052,7 @@
         </w:tc>
         <w:tc>
           <w:tcPr>
-            <w:tcW w:type="dxa" w:w="897"/>
+            <w:tcW w:type="dxa" w:w="896"/>
             <w:tcBorders>
               <w:top w:val="single" w:color="BFC9D6" w:sz="4"/>
               <w:left w:val="single" w:color="BFC9D6" w:sz="4"/>
@@ -20056,7 +20089,7 @@
         </w:tc>
         <w:tc>
           <w:tcPr>
-            <w:tcW w:type="dxa" w:w="1691"/>
+            <w:tcW w:type="dxa" w:w="1665"/>
             <w:tcBorders>
               <w:top w:val="single" w:color="BFC9D6" w:sz="4"/>
               <w:left w:val="single" w:color="BFC9D6" w:sz="4"/>
@@ -20093,7 +20126,7 @@
         </w:tc>
         <w:tc>
           <w:tcPr>
-            <w:tcW w:type="dxa" w:w="5338"/>
+            <w:tcW w:type="dxa" w:w="5383"/>
             <w:tcBorders>
               <w:top w:val="single" w:color="BFC9D6" w:sz="4"/>
               <w:left w:val="single" w:color="BFC9D6" w:sz="4"/>
@@ -20135,7 +20168,7 @@
         </w:trPr>
         <w:tc>
           <w:tcPr>
-            <w:tcW w:type="dxa" w:w="1041"/>
+            <w:tcW w:type="dxa" w:w="1024"/>
             <w:tcBorders>
               <w:top w:val="single" w:color="BFC9D6" w:sz="4"/>
               <w:left w:val="single" w:color="BFC9D6" w:sz="4"/>
@@ -20171,7 +20204,7 @@
         </w:tc>
         <w:tc>
           <w:tcPr>
-            <w:tcW w:type="dxa" w:w="897"/>
+            <w:tcW w:type="dxa" w:w="896"/>
             <w:tcBorders>
               <w:top w:val="single" w:color="BFC9D6" w:sz="4"/>
               <w:left w:val="single" w:color="BFC9D6" w:sz="4"/>
@@ -20207,7 +20240,7 @@
         </w:tc>
         <w:tc>
           <w:tcPr>
-            <w:tcW w:type="dxa" w:w="897"/>
+            <w:tcW w:type="dxa" w:w="896"/>
             <w:tcBorders>
               <w:top w:val="single" w:color="BFC9D6" w:sz="4"/>
               <w:left w:val="single" w:color="BFC9D6" w:sz="4"/>
@@ -20243,7 +20276,7 @@
         </w:tc>
         <w:tc>
           <w:tcPr>
-            <w:tcW w:type="dxa" w:w="1691"/>
+            <w:tcW w:type="dxa" w:w="1665"/>
             <w:tcBorders>
               <w:top w:val="single" w:color="BFC9D6" w:sz="4"/>
               <w:left w:val="single" w:color="BFC9D6" w:sz="4"/>
@@ -20279,7 +20312,7 @@
         </w:tc>
         <w:tc>
           <w:tcPr>
-            <w:tcW w:type="dxa" w:w="5338"/>
+            <w:tcW w:type="dxa" w:w="5383"/>
             <w:tcBorders>
               <w:top w:val="single" w:color="BFC9D6" w:sz="4"/>
               <w:left w:val="single" w:color="BFC9D6" w:sz="4"/>
@@ -20320,7 +20353,7 @@
         </w:trPr>
         <w:tc>
           <w:tcPr>
-            <w:tcW w:type="dxa" w:w="1041"/>
+            <w:tcW w:type="dxa" w:w="1024"/>
             <w:tcBorders>
               <w:top w:val="single" w:color="BFC9D6" w:sz="4"/>
               <w:left w:val="single" w:color="BFC9D6" w:sz="4"/>
@@ -20357,7 +20390,7 @@
         </w:tc>
         <w:tc>
           <w:tcPr>
-            <w:tcW w:type="dxa" w:w="897"/>
+            <w:tcW w:type="dxa" w:w="896"/>
             <w:tcBorders>
               <w:top w:val="single" w:color="BFC9D6" w:sz="4"/>
               <w:left w:val="single" w:color="BFC9D6" w:sz="4"/>
@@ -20394,7 +20427,7 @@
         </w:tc>
         <w:tc>
           <w:tcPr>
-            <w:tcW w:type="dxa" w:w="897"/>
+            <w:tcW w:type="dxa" w:w="896"/>
             <w:tcBorders>
               <w:top w:val="single" w:color="BFC9D6" w:sz="4"/>
               <w:left w:val="single" w:color="BFC9D6" w:sz="4"/>
@@ -20431,7 +20464,7 @@
         </w:tc>
         <w:tc>
           <w:tcPr>
-            <w:tcW w:type="dxa" w:w="1691"/>
+            <w:tcW w:type="dxa" w:w="1665"/>
             <w:tcBorders>
               <w:top w:val="single" w:color="BFC9D6" w:sz="4"/>
               <w:left w:val="single" w:color="BFC9D6" w:sz="4"/>
@@ -20468,7 +20501,7 @@
         </w:tc>
         <w:tc>
           <w:tcPr>
-            <w:tcW w:type="dxa" w:w="5338"/>
+            <w:tcW w:type="dxa" w:w="5383"/>
             <w:tcBorders>
               <w:top w:val="single" w:color="BFC9D6" w:sz="4"/>
               <w:left w:val="single" w:color="BFC9D6" w:sz="4"/>
@@ -20510,7 +20543,7 @@
         </w:trPr>
         <w:tc>
           <w:tcPr>
-            <w:tcW w:type="dxa" w:w="1041"/>
+            <w:tcW w:type="dxa" w:w="1024"/>
             <w:tcBorders>
               <w:top w:val="single" w:color="BFC9D6" w:sz="4"/>
               <w:left w:val="single" w:color="BFC9D6" w:sz="4"/>
@@ -20546,7 +20579,7 @@
         </w:tc>
         <w:tc>
           <w:tcPr>
-            <w:tcW w:type="dxa" w:w="897"/>
+            <w:tcW w:type="dxa" w:w="896"/>
             <w:tcBorders>
               <w:top w:val="single" w:color="BFC9D6" w:sz="4"/>
               <w:left w:val="single" w:color="BFC9D6" w:sz="4"/>
@@ -20582,7 +20615,7 @@
         </w:tc>
         <w:tc>
           <w:tcPr>
-            <w:tcW w:type="dxa" w:w="897"/>
+            <w:tcW w:type="dxa" w:w="896"/>
             <w:tcBorders>
               <w:top w:val="single" w:color="BFC9D6" w:sz="4"/>
               <w:left w:val="single" w:color="BFC9D6" w:sz="4"/>
@@ -20618,73 +20651,82 @@
         </w:tc>
         <w:tc>
           <w:tcPr>
-            <w:tcW w:type="dxa" w:w="1691"/>
-            <w:tcBorders>
-              <w:top w:val="single" w:color="BFC9D6" w:sz="4"/>
-              <w:left w:val="single" w:color="BFC9D6" w:sz="4"/>
-              <w:bottom w:val="single" w:color="BFC9D6" w:sz="4"/>
-              <w:right w:val="single" w:color="BFC9D6" w:sz="4"/>
-            </w:tcBorders>
-            <w:tcMar>
-              <w:top w:type="dxa" w:w="50"/>
-              <w:left w:type="dxa" w:w="90"/>
-              <w:bottom w:type="dxa" w:w="50"/>
-              <w:right w:type="dxa" w:w="90"/>
-            </w:tcMar>
-            <w:vAlign w:val="top"/>
-          </w:tcPr>
-          <w:p>
-            <w:pPr>
-              <w:keepNext w:val="false"/>
-              <w:bidi/>
-              <w:spacing w:after="30" w:before="30" w:line="264"/>
-            </w:pPr>
-            <w:r>
-              <w:rPr>
-                <w:rFonts w:ascii="Arial" w:cs="Arial" w:eastAsia="Arial" w:hAnsi="Arial"/>
-                <w:b w:val="false"/>
-                <w:bCs w:val="false"/>
-                <w:sz w:val="18"/>
-                <w:szCs w:val="18"/>
-                <w:rtl/>
-              </w:rPr>
-              <w:t xml:space="preserve">مفتوح؛ بوابة S0</w:t>
-            </w:r>
-          </w:p>
-        </w:tc>
-        <w:tc>
-          <w:tcPr>
-            <w:tcW w:type="dxa" w:w="5338"/>
-            <w:tcBorders>
-              <w:top w:val="single" w:color="BFC9D6" w:sz="4"/>
-              <w:left w:val="single" w:color="BFC9D6" w:sz="4"/>
-              <w:bottom w:val="single" w:color="BFC9D6" w:sz="4"/>
-              <w:right w:val="single" w:color="BFC9D6" w:sz="4"/>
-            </w:tcBorders>
-            <w:tcMar>
-              <w:top w:type="dxa" w:w="50"/>
-              <w:left w:type="dxa" w:w="90"/>
-              <w:bottom w:type="dxa" w:w="50"/>
-              <w:right w:type="dxa" w:w="90"/>
-            </w:tcMar>
-            <w:vAlign w:val="top"/>
-          </w:tcPr>
-          <w:p>
-            <w:pPr>
-              <w:keepNext w:val="false"/>
-              <w:bidi/>
-              <w:spacing w:after="30" w:before="30" w:line="264"/>
-            </w:pPr>
-            <w:r>
-              <w:rPr>
-                <w:rFonts w:ascii="Arial" w:cs="Arial" w:eastAsia="Arial" w:hAnsi="Arial"/>
-                <w:b w:val="false"/>
-                <w:bCs w:val="false"/>
-                <w:sz w:val="18"/>
-                <w:szCs w:val="18"/>
-                <w:rtl/>
-              </w:rPr>
-              <w:t xml:space="preserve">docs/review/design-review-2026-10-11.json</w:t>
+            <w:tcW w:type="dxa" w:w="1665"/>
+            <w:tcBorders>
+              <w:top w:val="single" w:color="BFC9D6" w:sz="4"/>
+              <w:left w:val="single" w:color="BFC9D6" w:sz="4"/>
+              <w:bottom w:val="single" w:color="BFC9D6" w:sz="4"/>
+              <w:right w:val="single" w:color="BFC9D6" w:sz="4"/>
+            </w:tcBorders>
+            <w:tcMar>
+              <w:top w:type="dxa" w:w="50"/>
+              <w:left w:type="dxa" w:w="90"/>
+              <w:bottom w:type="dxa" w:w="50"/>
+              <w:right w:type="dxa" w:w="90"/>
+            </w:tcMar>
+            <w:vAlign w:val="top"/>
+          </w:tcPr>
+          <w:p>
+            <w:pPr>
+              <w:keepNext w:val="false"/>
+              <w:bidi/>
+              <w:spacing w:after="30" w:before="30" w:line="264"/>
+            </w:pPr>
+            <w:r>
+              <w:rPr>
+                <w:rFonts w:ascii="Segoe UI Emoji" w:cs="Segoe UI Emoji" w:eastAsia="Segoe UI Emoji" w:hAnsi="Segoe UI Emoji"/>
+                <w:sz w:val="18"/>
+                <w:szCs w:val="18"/>
+                <w:rtl/>
+              </w:rPr>
+              <w:t xml:space="preserve">✅</w:t>
+            </w:r>
+            <w:r>
+              <w:rPr>
+                <w:rFonts w:ascii="Arial" w:cs="Arial" w:eastAsia="Arial" w:hAnsi="Arial"/>
+                <w:b w:val="false"/>
+                <w:bCs w:val="false"/>
+                <w:sz w:val="18"/>
+                <w:szCs w:val="18"/>
+                <w:rtl/>
+              </w:rPr>
+              <w:t xml:space="preserve"> مغلق (2026-10-13): الدفعة (أ) منفّذة، والباقي شروط دخول شرائحه (ADR 0011)</w:t>
+            </w:r>
+          </w:p>
+        </w:tc>
+        <w:tc>
+          <w:tcPr>
+            <w:tcW w:type="dxa" w:w="5383"/>
+            <w:tcBorders>
+              <w:top w:val="single" w:color="BFC9D6" w:sz="4"/>
+              <w:left w:val="single" w:color="BFC9D6" w:sz="4"/>
+              <w:bottom w:val="single" w:color="BFC9D6" w:sz="4"/>
+              <w:right w:val="single" w:color="BFC9D6" w:sz="4"/>
+            </w:tcBorders>
+            <w:tcMar>
+              <w:top w:type="dxa" w:w="50"/>
+              <w:left w:type="dxa" w:w="90"/>
+              <w:bottom w:type="dxa" w:w="50"/>
+              <w:right w:type="dxa" w:w="90"/>
+            </w:tcMar>
+            <w:vAlign w:val="top"/>
+          </w:tcPr>
+          <w:p>
+            <w:pPr>
+              <w:keepNext w:val="false"/>
+              <w:bidi/>
+              <w:spacing w:after="30" w:before="30" w:line="264"/>
+            </w:pPr>
+            <w:r>
+              <w:rPr>
+                <w:rFonts w:ascii="Arial" w:cs="Arial" w:eastAsia="Arial" w:hAnsi="Arial"/>
+                <w:b w:val="false"/>
+                <w:bCs w:val="false"/>
+                <w:sz w:val="18"/>
+                <w:szCs w:val="18"/>
+                <w:rtl/>
+              </w:rPr>
+              <w:t xml:space="preserve">docs/review/design-review-2026-10-11.json، docs/32-review-findings-decisions.md</w:t>
             </w:r>
           </w:p>
         </w:tc>

</xml_diff>

<commit_message>
Apply the owner's answers: close the 155 open questions and add the current-event scenario
The owner approved the recommended default of the 148 open questions of the module
specifications and of register items O-03, O-05 and O-06, and gave the details of the
current-event scenario. All 155 questions are marked decided; O-07 is closed.

Credit assessment 2.2 (ADR 0020): a seventh macro scenario GULF_SHIPPING_CONFLICT
(a year-long conflict on the Gulf shipping routes), a multiplier of a scenario per
country (fin.MacroScenarioCountry), and the share of committed undrawn limits that
stays available in a scenario (0 here: the banks stop the undrawn limits). Engine,
reference, seed, generated cases (140, with a Kuwait importer variant), tests, docs,
ERD and Word files updated.

Co-Authored-By: Claude Opus 5.5 <noreply@anthropic.com>
Claude-Session: https://claude.ai/code/session_012HHcRrzuvMBTL2FYxXtsyv
</commit_message>
<xml_diff>
--- a/treasury-platform/docs/30-readiness/word/DOC-B09-raci-and-decision-ownership.docx
+++ b/treasury-platform/docs/30-readiness/word/DOC-B09-raci-and-decision-ownership.docx
@@ -4188,14 +4188,47 @@
             </w:pPr>
             <w:r>
               <w:rPr>
-                <w:rFonts w:ascii="Arial" w:cs="Arial" w:eastAsia="Arial" w:hAnsi="Arial"/>
-                <w:b w:val="false"/>
-                <w:bCs w:val="false"/>
-                <w:sz w:val="18"/>
-                <w:szCs w:val="18"/>
-                <w:rtl/>
-              </w:rPr>
-              <w:t xml:space="preserve">مفتوح</w:t>
+                <w:rFonts w:ascii="Segoe UI Emoji" w:cs="Segoe UI Emoji" w:eastAsia="Segoe UI Emoji" w:hAnsi="Segoe UI Emoji"/>
+                <w:sz w:val="18"/>
+                <w:szCs w:val="18"/>
+                <w:rtl/>
+              </w:rPr>
+              <w:t xml:space="preserve">✅</w:t>
+            </w:r>
+            <w:r>
+              <w:rPr>
+                <w:rFonts w:ascii="Arial" w:cs="Arial" w:eastAsia="Arial" w:hAnsi="Arial"/>
+                <w:b w:val="false"/>
+                <w:bCs w:val="false"/>
+                <w:sz w:val="18"/>
+                <w:szCs w:val="18"/>
+                <w:rtl/>
+              </w:rPr>
+              <w:t xml:space="preserve"> مغلق: اعتمد المالك الافتراضيات الـ148 الباقية 2026-10-19، فالأسئلة الـ155 محسومة (</w:t>
+            </w:r>
+            <w:r>
+              <w:rPr>
+                <w:rFonts w:ascii="Courier New" w:cs="Courier New" w:eastAsia="Courier New" w:hAnsi="Courier New"/>
+                <w:b w:val="false"/>
+                <w:bCs w:val="false"/>
+                <w:color w:val="1F2937"/>
+                <w:sz w:val="16"/>
+                <w:szCs w:val="16"/>
+                <w:shd w:fill="F1F3F5" w:color="auto" w:val="clear"/>
+                <w:rtl/>
+              </w:rPr>
+              <w:t xml:space="preserve">‎docs/31-owner-decisions.md‎</w:t>
+            </w:r>
+            <w:r>
+              <w:rPr>
+                <w:rFonts w:ascii="Arial" w:cs="Arial" w:eastAsia="Arial" w:hAnsi="Arial"/>
+                <w:b w:val="false"/>
+                <w:bCs w:val="false"/>
+                <w:sz w:val="18"/>
+                <w:szCs w:val="18"/>
+                <w:rtl/>
+              </w:rPr>
+              <w:t xml:space="preserve"> القرار 31)</w:t>
             </w:r>
           </w:p>
         </w:tc>
@@ -4231,7 +4264,7 @@
                 <w:szCs w:val="18"/>
                 <w:rtl/>
               </w:rPr>
-              <w:t xml:space="preserve">مالك وموعد لكل سؤال، وحسم أسئلة S0 التسعة (§7.4)</w:t>
+              <w:t xml:space="preserve">لا شيء للبوابة</w:t>
             </w:r>
           </w:p>
         </w:tc>

</xml_diff>